<commit_message>
Visual Check report: point to the right trade, not retired services
The footer told a client to buy a Condition Report or a Technical
Sign-off for a view on the photographs. Both came off the menu on
9 October 2026. It now says we can bring in the right trade to look
and quote, the one next step the Visual Check offers.

Co-Authored-By: Claude Opus 5.5 <noreply@anthropic.com>
</commit_message>
<xml_diff>
--- a/concierge-deploy/public/templates/visual-check.docx
+++ b/concierge-deploy/public/templates/visual-check.docx
@@ -434,7 +434,7 @@
           <w:sz w:val="16"/>
           <w:szCs w:val="16"/>
         </w:rPr>
-        <w:t xml:space="preserve">, seven years of UK construction and IoT project management, supplying professional services as a sole trader. The checker who attends records and photographs. They do not rate what they see, give an opinion on it, or advise. If you want a view on what the photographs show, that is a Condition Report or a Technical Sign-off.</w:t>
+        <w:t xml:space="preserve">, seven years of UK construction and IoT project management, supplying professional services as a sole trader. The checker who attends records and photographs. They do not rate what they see, give an opinion on it, or advise. If something in the photographs needs looking at, we can bring in the right trade to look at it and quote.</w:t>
       </w:r>
     </w:p>
     <w:p>
@@ -9830,6 +9830,7 @@
               <w:bottom w:type="dxa" w:w="70"/>
               <w:right w:type="dxa" w:w="100"/>
             </w:tcMar>
+            <w:vAlign w:val="bottom"/>
           </w:tcPr>
           <w:p>
             <w:pPr>
@@ -9852,6 +9853,7 @@
               <w:bottom w:type="dxa" w:w="70"/>
               <w:right w:type="dxa" w:w="100"/>
             </w:tcMar>
+            <w:vAlign w:val="bottom"/>
           </w:tcPr>
           <w:p>
             <w:pPr>
@@ -9874,6 +9876,7 @@
               <w:bottom w:type="dxa" w:w="70"/>
               <w:right w:type="dxa" w:w="100"/>
             </w:tcMar>
+            <w:vAlign w:val="bottom"/>
           </w:tcPr>
           <w:p>
             <w:pPr>
@@ -9896,6 +9899,7 @@
               <w:bottom w:type="dxa" w:w="70"/>
               <w:right w:type="dxa" w:w="100"/>
             </w:tcMar>
+            <w:vAlign w:val="bottom"/>
           </w:tcPr>
           <w:p>
             <w:pPr>

</xml_diff>